<commit_message>
Sync docs and update site content from 최종본 (2026-06-16)
문서 동기화:
- docs/ 폴더에 최신 docx 9개 복사 (백서·사업계획서·실무계획·조합원제안서·ESG제안서·지자체3종·키움증권)

5대(오중) 돌봄 체계 반영:
- index.html: 4대→5대(오중) 돌봄, 청년/장애인 비전 카드 추가, vision-grid 5열로 확장
- index.html: 히어로 서브카피 브랜드 슬로건으로 교체, CTA 버튼 3개로 확장
- about.html: 오중 섹션 설명문에 청년/장애인 추가

파트너십 업데이트:
- proposals.html: 기업 ESG 섹션 설명문 5대 돌봄으로 수정
- proposals.html: 현대자동차그룹 카드 신규 추가 (REC·친환경실증·CSR)

입주비 차등 구조 반영:
- join.html FAQ: 독립생활형/경증요양형/중증케어형 3단계 비용 명시
- community.html: 취약계층 '삶의 전환·재기' 0원 입주 경로 추가

불필요한 표현 정리:
- community.html: 'v9 재무모델', 'BEP +1.24억' 수치 제거
- community.html: '4대 사회적기업 매출' → '사회적기업 수익'으로 수정

Co-Authored-By: Claude Sonnet 4.6 <noreply@anthropic.com>
</commit_message>
<xml_diff>
--- a/docs/자연돌봄공동체_가평군제안서.docx
+++ b/docs/자연돌봄공동체_가평군제안서.docx
@@ -2310,7 +2310,7 @@
               <w:spacing w:after="20" w:line="252"/>
             </w:pPr>
             <w:r>
-              <w:t xml:space="preserve">⑤ 장애인 자립 돌봄</w:t>
+              <w:t xml:space="preserve">⑤ 청년·장애인 자립 돌봄</w:t>
             </w:r>
           </w:p>
         </w:tc>
@@ -2336,7 +2336,7 @@
               <w:spacing w:after="20" w:line="252"/>
             </w:pPr>
             <w:r>
-              <w:t xml:space="preserve">가구공방·스마트팜 포장 공정 연계 보호고용 → 발달장애 청년에게 존엄한 일자리</w:t>
+              <w:t xml:space="preserve">청년 창업·멘토링 + 발달장애 자립(직업훈련·지원고용)·평생 돌봄 — 가구공방·스마트팜 연계 보호고용으로 존엄한 일자리</w:t>
             </w:r>
           </w:p>
         </w:tc>
@@ -2891,7 +2891,7 @@
               <w:spacing w:after="20" w:line="252"/>
             </w:pPr>
             <w:r>
-              <w:t xml:space="preserve">⑤ 산림·반려 비즈니스</w:t>
+              <w:t xml:space="preserve">⑤ 산림·치유농업·반려 비즈니스</w:t>
             </w:r>
           </w:p>
         </w:tc>
@@ -2917,7 +2917,7 @@
               <w:spacing w:after="20" w:line="252"/>
             </w:pPr>
             <w:r>
-              <w:t xml:space="preserve">도시민 치유 프로그램, 유기견 입양·전문 훈련 수입</w:t>
+              <w:t xml:space="preserve">도시민 산림치유·치유농업(6차산업) 체험, 유기견 입양·전문 훈련 수입</w:t>
             </w:r>
           </w:p>
         </w:tc>
@@ -2943,7 +2943,7 @@
               <w:spacing w:after="20" w:line="252"/>
             </w:pPr>
             <w:r>
-              <w:t xml:space="preserve">고용노동부 일자리 지원</w:t>
+              <w:t xml:space="preserve">고용노동부 일자리 지원 / 농진청 치유농업</w:t>
             </w:r>
           </w:p>
         </w:tc>

</xml_diff>